<commit_message>
fix(ccos): mantém o XIII CCOS em 2027 após o cancelamento de 2026
O CCOS 2026 foi cancelado sem realização. Como em 2020-2021 e 2025, ano sem campeonato não consome número de edição. Decisão alinhada com a FECORI em 2026-10-31.
</commit_message>
<xml_diff>
--- a/Documentos/2027/regulamentoDasCompeticoesCearenses.docx
+++ b/Documentos/2027/regulamentoDasCompeticoesCearenses.docx
@@ -2,11 +2,11 @@
 <file path=word/document.xml><?xml version="1.0" encoding="utf-8"?>
 <w:document xmlns:w="http://schemas.openxmlformats.org/wordprocessingml/2006/main" xmlns:m="http://schemas.openxmlformats.org/officeDocument/2006/math" xmlns:r="http://schemas.openxmlformats.org/officeDocument/2006/relationships" xmlns:o="urn:schemas-microsoft-com:office:office" xmlns:v="urn:schemas-microsoft-com:vml" xmlns:w10="urn:schemas-microsoft-com:office:word" xmlns:a="http://schemas.openxmlformats.org/drawingml/2006/main" xmlns:pic="http://schemas.openxmlformats.org/drawingml/2006/picture" xmlns:wp="http://schemas.openxmlformats.org/drawingml/2006/wordprocessingDrawing">
   <w:body>
-    <w:bookmarkStart w:id="31" w:name="X9d2b1a7d218659fd06a36ab5598bc81824129ff"/>
     <w:p>
       <w:pPr>
         <w:pStyle w:val="Ttulo1"/>
       </w:pPr>
+      <w:bookmarkStart w:id="18" w:name="_9d2b1a7d218659fd06a36ab5598bc81824129ff"/>
       <w:r>
         <w:rPr>
           <w:b/>
@@ -14,15 +14,17 @@
         </w:rPr>
         <w:t xml:space="preserve">Regulamento das Competições Cearenses de Orientação</w:t>
       </w:r>
-    </w:p>
-    <w:bookmarkStart w:id="20" w:name="disposições-gerais"/>
+      <w:bookmarkEnd w:id="18"/>
+    </w:p>
     <w:p>
       <w:pPr>
         <w:pStyle w:val="Ttulo2"/>
       </w:pPr>
+      <w:bookmarkStart w:id="19" w:name="_a6e7f1ce165a32c85b2d0134e35bb89358c6f39"/>
       <w:r>
         <w:t xml:space="preserve">1. Disposições Gerais</w:t>
       </w:r>
+      <w:bookmarkEnd w:id="19"/>
     </w:p>
     <w:p>
       <w:pPr>
@@ -76,7 +78,7 @@
       <w:r>
         <w:t xml:space="preserve"> </w:t>
       </w:r>
-      <w:hyperlink r:id="rId18">
+      <w:hyperlink r:id="rId20">
         <w:r>
           <w:rPr>
             <w:rStyle w:val="Hyperlink"/>
@@ -93,7 +95,7 @@
       <w:r>
         <w:t xml:space="preserve"> </w:t>
       </w:r>
-      <w:hyperlink r:id="rId19">
+      <w:hyperlink r:id="rId21">
         <w:r>
           <w:rPr>
             <w:rStyle w:val="Hyperlink"/>
@@ -323,15 +325,15 @@
         <w:t xml:space="preserve">.</w:t>
       </w:r>
     </w:p>
-    <w:bookmarkEnd w:id="20"/>
-    <w:bookmarkStart w:id="23" w:name="das-competições"/>
     <w:p>
       <w:pPr>
         <w:pStyle w:val="Ttulo2"/>
       </w:pPr>
+      <w:bookmarkStart w:id="22" w:name="_6ef8de631041678458a7913c6e82e5afd649ab2"/>
       <w:r>
         <w:t xml:space="preserve">2. Das Competições</w:t>
       </w:r>
+      <w:bookmarkEnd w:id="22"/>
     </w:p>
     <w:p>
       <w:pPr>
@@ -473,14 +475,15 @@
         <w:t xml:space="preserve">– A organização geral de cada competição é de responsabilidade de um ou mais clubes filiados à FECORI, conforme calendários abaixo:</w:t>
       </w:r>
     </w:p>
-    <w:bookmarkStart w:id="21" w:name="X479627b0f83430c2eb5776af2e8d1f03aa15fbc"/>
     <w:p>
       <w:pPr>
         <w:pStyle w:val="Ttulo3"/>
       </w:pPr>
+      <w:bookmarkStart w:id="23" w:name="_479627b0f83430c2eb5776af2e8d1f03aa15fbc"/>
       <w:r>
         <w:t xml:space="preserve">Calendário do XXI Campeonato Cearense de Orientação</w:t>
       </w:r>
+      <w:bookmarkEnd w:id="23"/>
     </w:p>
     <w:p>
       <w:pPr>
@@ -783,15 +786,15 @@
         </w:tc>
       </w:tr>
     </w:tbl>
-    <w:bookmarkEnd w:id="21"/>
-    <w:bookmarkStart w:id="22" w:name="Xf9d55af0d68caa850d6924bb943ae0db3b99508"/>
     <w:p>
       <w:pPr>
         <w:pStyle w:val="Ttulo3"/>
       </w:pPr>
-      <w:r>
-        <w:t xml:space="preserve">Calendário do XIV Campeonato Cearense de Orientação Sprint</w:t>
-      </w:r>
+      <w:bookmarkStart w:id="24" w:name="_de212d8191c1b9b431673d22fdea9a20533bd1d"/>
+      <w:r>
+        <w:t xml:space="preserve">Calendário do XIII Campeonato Cearense de Orientação Sprint</w:t>
+      </w:r>
+      <w:bookmarkEnd w:id="24"/>
     </w:p>
     <w:p>
       <w:pPr>
@@ -1106,16 +1109,15 @@
         <w:t xml:space="preserve">, conforme itens 5.1 e 35.6 da ROP.</w:t>
       </w:r>
     </w:p>
-    <w:bookmarkEnd w:id="22"/>
-    <w:bookmarkEnd w:id="23"/>
-    <w:bookmarkStart w:id="24" w:name="das-categorias-e-uniformes"/>
     <w:p>
       <w:pPr>
         <w:pStyle w:val="Ttulo2"/>
       </w:pPr>
+      <w:bookmarkStart w:id="25" w:name="_8d6f6ec9fb35a7c7731442cc09636e7f4f7da17"/>
       <w:r>
         <w:t xml:space="preserve">3. Das Categorias e Uniformes</w:t>
       </w:r>
+      <w:bookmarkEnd w:id="25"/>
     </w:p>
     <w:p>
       <w:pPr>
@@ -1393,15 +1395,15 @@
         <w:t xml:space="preserve">, poderão ser usados calção e camiseta cavada.</w:t>
       </w:r>
     </w:p>
-    <w:bookmarkEnd w:id="24"/>
-    <w:bookmarkStart w:id="25" w:name="da-inscrição-e-responsabilidades"/>
     <w:p>
       <w:pPr>
         <w:pStyle w:val="Ttulo2"/>
       </w:pPr>
+      <w:bookmarkStart w:id="26" w:name="_9f4e2642e943adec5c5d05fbe7afe98a4104b9d"/>
       <w:r>
         <w:t xml:space="preserve">4. Da Inscrição e Responsabilidades</w:t>
       </w:r>
+      <w:bookmarkEnd w:id="26"/>
     </w:p>
     <w:p>
       <w:pPr>
@@ -1709,15 +1711,15 @@
         <w:t xml:space="preserve">– Caso o número de inscritos supere a quantidade de SI-Cards disponíveis, a prioridade será das categorias Elite, Alfa, Bravo e Novato (nesta ordem). Atletas não contemplados receberão estorno da taxa de aluguel.</w:t>
       </w:r>
     </w:p>
-    <w:bookmarkEnd w:id="25"/>
-    <w:bookmarkStart w:id="26" w:name="da-apuração-partida-e-classificação"/>
     <w:p>
       <w:pPr>
         <w:pStyle w:val="Ttulo2"/>
       </w:pPr>
+      <w:bookmarkStart w:id="27" w:name="_f507ff8f91e2e18184faab4a9daad053cce83f6"/>
       <w:r>
         <w:t xml:space="preserve">5. Da Apuração, Partida e Classificação</w:t>
       </w:r>
+      <w:bookmarkEnd w:id="27"/>
     </w:p>
     <w:p>
       <w:pPr>
@@ -1897,15 +1899,15 @@
         <w:t xml:space="preserve">O não cumprimento desta regra gerará penalização, tornando a etapa/percurso não passível de descarte.</w:t>
       </w:r>
     </w:p>
-    <w:bookmarkEnd w:id="26"/>
-    <w:bookmarkStart w:id="27" w:name="X89a63427626da8f2bc271701c70d2142ead9eb8"/>
     <w:p>
       <w:pPr>
         <w:pStyle w:val="Ttulo2"/>
       </w:pPr>
+      <w:bookmarkStart w:id="28" w:name="_89a63427626da8f2bc271701c70d2142ead9eb8"/>
       <w:r>
         <w:t xml:space="preserve">6. Das Infrações, Desclassificação e Júri Técnico</w:t>
       </w:r>
+      <w:bookmarkEnd w:id="28"/>
     </w:p>
     <w:p>
       <w:pPr>
@@ -2015,15 +2017,15 @@
         <w:t xml:space="preserve">– O objetivo, composição e prerrogativas do Júri Técnico obedecem às DIRETRIZES PARA OS JÚRIS EM EVENTOS OFICIAIS da CBO e ao item 38 da ROP.</w:t>
       </w:r>
     </w:p>
-    <w:bookmarkEnd w:id="27"/>
-    <w:bookmarkStart w:id="28" w:name="da-segurança"/>
     <w:p>
       <w:pPr>
         <w:pStyle w:val="Ttulo2"/>
       </w:pPr>
+      <w:bookmarkStart w:id="29" w:name="_62e62fa573db64b6eb29a54679b5a96f7ac76ef"/>
       <w:r>
         <w:t xml:space="preserve">7. Da Segurança</w:t>
       </w:r>
+      <w:bookmarkEnd w:id="29"/>
     </w:p>
     <w:p>
       <w:pPr>
@@ -2079,15 +2081,15 @@
         <w:t xml:space="preserve">– Deverão ser ressaltados nos avisos preliminares, antes da partida da primeira bateria de atletas, bem como indicados nos mapas, os pontos que apresentam qualquer perigo ou áreas interditadas para a competição.</w:t>
       </w:r>
     </w:p>
-    <w:bookmarkEnd w:id="28"/>
-    <w:bookmarkStart w:id="29" w:name="da-pontuação-e-apuração-do-campeonato"/>
     <w:p>
       <w:pPr>
         <w:pStyle w:val="Ttulo2"/>
       </w:pPr>
+      <w:bookmarkStart w:id="30" w:name="_495c9840cf80b6b9e853072c0a5a3a3733cdf44"/>
       <w:r>
         <w:t xml:space="preserve">8. Da Pontuação e Apuração do Campeonato</w:t>
       </w:r>
+      <w:bookmarkEnd w:id="30"/>
     </w:p>
     <w:p>
       <w:pPr>
@@ -2532,15 +2534,15 @@
         <w:t xml:space="preserve">Em caso de empate entre clubes, vence o que tiver mais primeiros lugares, depois segundos, sucessivamente até o desempate.</w:t>
       </w:r>
     </w:p>
-    <w:bookmarkEnd w:id="29"/>
-    <w:bookmarkStart w:id="30" w:name="da-premiação"/>
     <w:p>
       <w:pPr>
         <w:pStyle w:val="Ttulo2"/>
       </w:pPr>
+      <w:bookmarkStart w:id="31" w:name="_e4c2195cf89f563f8a5f7bcbbecd531f59ebcd3"/>
       <w:r>
         <w:t xml:space="preserve">9. Da Premiação</w:t>
       </w:r>
+      <w:bookmarkEnd w:id="31"/>
     </w:p>
     <w:p>
       <w:pPr>
@@ -2723,16 +2725,14 @@
         <w:t xml:space="preserve">Fortaleza/CE, 27 de abril de 2027.</w:t>
       </w:r>
     </w:p>
-    <w:bookmarkEnd w:id="30"/>
-    <w:bookmarkEnd w:id="31"/>
     <w:sectPr>
-      <w:headerReference r:id="rId8" w:type="default"/>
-      <w:footerReference r:id="rId9" w:type="default"/>
+      <w:headerReference w:type="default" r:id="rId8"/>
+      <w:footerReference w:type="default" r:id="rId9"/>
       <w:footnotePr>
         <w:numRestart w:val="eachSect"/>
       </w:footnotePr>
-      <w:pgSz w:code="9" w:h="16840" w:w="11907"/>
-      <w:pgMar w:bottom="993" w:footer="567" w:gutter="0" w:header="567" w:left="567" w:right="567" w:top="1701"/>
+      <w:pgSz w:w="11907" w:h="16840" w:code="9"/>
+      <w:pgMar w:top="1701" w:right="567" w:bottom="993" w:left="567" w:header="567" w:footer="567" w:gutter="0"/>
       <w:cols w:space="720"/>
     </w:sectPr>
   </w:body>
@@ -3104,8 +3104,8 @@
 </file>
 
 <file path=word/numbering.xml><?xml version="1.0" encoding="utf-8"?>
-<w:numbering xmlns:aink="http://schemas.microsoft.com/office/drawing/2016/ink" xmlns:am3d="http://schemas.microsoft.com/office/drawing/2017/model3d" xmlns:cx="http://schemas.microsoft.com/office/drawing/2014/chartex" xmlns:cx1="http://schemas.microsoft.com/office/drawing/2015/9/8/chartex" xmlns:cx2="http://schemas.microsoft.com/office/drawing/2015/10/21/chartex" xmlns:cx3="http://schemas.microsoft.com/office/drawing/2016/5/9/chartex" xmlns:cx4="http://schemas.microsoft.com/office/drawing/2016/5/10/chartex" xmlns:cx5="http://schemas.microsoft.com/office/drawing/2016/5/11/chartex" xmlns:cx6="http://schemas.microsoft.com/office/drawing/2016/5/12/chartex" xmlns:cx7="http://schemas.microsoft.com/office/drawing/2016/5/13/chartex" xmlns:cx8="http://schemas.microsoft.com/office/drawing/2016/5/14/chartex" xmlns:m="http://schemas.openxmlformats.org/officeDocument/2006/math" xmlns:mc="http://schemas.openxmlformats.org/markup-compatibility/2006" xmlns:o="urn:schemas-microsoft-com:office:office" xmlns:oel="http://schemas.microsoft.com/office/2019/extlst" xmlns:r="http://schemas.openxmlformats.org/officeDocument/2006/relationships" xmlns:v="urn:schemas-microsoft-com:vml" xmlns:w="http://schemas.openxmlformats.org/wordprocessingml/2006/main" xmlns:w10="urn:schemas-microsoft-com:office:word" xmlns:w14="http://schemas.microsoft.com/office/word/2010/wordml" xmlns:w15="http://schemas.microsoft.com/office/word/2012/wordml" xmlns:w16="http://schemas.microsoft.com/office/word/2018/wordml" xmlns:w16cex="http://schemas.microsoft.com/office/word/2018/wordml/cex" xmlns:w16cid="http://schemas.microsoft.com/office/word/2016/wordml/cid" xmlns:w16du="http://schemas.microsoft.com/office/word/2023/wordml/word16du" xmlns:w16sdtdh="http://schemas.microsoft.com/office/word/2020/wordml/sdtdatahash" xmlns:w16sdtfl="http://schemas.microsoft.com/office/word/2024/wordml/sdtformatlock" xmlns:w16se="http://schemas.microsoft.com/office/word/2015/wordml/symex" xmlns:wne="http://schemas.microsoft.com/office/word/2006/wordml" xmlns:wp="http://schemas.openxmlformats.org/drawingml/2006/wordprocessingDrawing" xmlns:wp14="http://schemas.microsoft.com/office/word/2010/wordprocessingDrawing" xmlns:wpc="http://schemas.microsoft.com/office/word/2010/wordprocessingCanvas" xmlns:wpg="http://schemas.microsoft.com/office/word/2010/wordprocessingGroup" xmlns:wpi="http://schemas.microsoft.com/office/word/2010/wordprocessingInk" xmlns:wps="http://schemas.microsoft.com/office/word/2010/wordprocessingShape" mc:Ignorable="w14 w15 w16se w16cid w16 w16cex w16sdtdh w16sdtfl w16du wp14">
-  <w:abstractNum w15:restartNumberingAfterBreak="0" w:abstractNumId="0">
+<w:numbering xmlns:wpc="http://schemas.microsoft.com/office/word/2010/wordprocessingCanvas" xmlns:cx="http://schemas.microsoft.com/office/drawing/2014/chartex" xmlns:cx1="http://schemas.microsoft.com/office/drawing/2015/9/8/chartex" xmlns:cx2="http://schemas.microsoft.com/office/drawing/2015/10/21/chartex" xmlns:cx3="http://schemas.microsoft.com/office/drawing/2016/5/9/chartex" xmlns:cx4="http://schemas.microsoft.com/office/drawing/2016/5/10/chartex" xmlns:cx5="http://schemas.microsoft.com/office/drawing/2016/5/11/chartex" xmlns:cx6="http://schemas.microsoft.com/office/drawing/2016/5/12/chartex" xmlns:cx7="http://schemas.microsoft.com/office/drawing/2016/5/13/chartex" xmlns:cx8="http://schemas.microsoft.com/office/drawing/2016/5/14/chartex" xmlns:mc="http://schemas.openxmlformats.org/markup-compatibility/2006" xmlns:aink="http://schemas.microsoft.com/office/drawing/2016/ink" xmlns:am3d="http://schemas.microsoft.com/office/drawing/2017/model3d" xmlns:o="urn:schemas-microsoft-com:office:office" xmlns:oel="http://schemas.microsoft.com/office/2019/extlst" xmlns:r="http://schemas.openxmlformats.org/officeDocument/2006/relationships" xmlns:m="http://schemas.openxmlformats.org/officeDocument/2006/math" xmlns:v="urn:schemas-microsoft-com:vml" xmlns:wp14="http://schemas.microsoft.com/office/word/2010/wordprocessingDrawing" xmlns:wp="http://schemas.openxmlformats.org/drawingml/2006/wordprocessingDrawing" xmlns:w10="urn:schemas-microsoft-com:office:word" xmlns:w="http://schemas.openxmlformats.org/wordprocessingml/2006/main" xmlns:w14="http://schemas.microsoft.com/office/word/2010/wordml" xmlns:w15="http://schemas.microsoft.com/office/word/2012/wordml" xmlns:w16cex="http://schemas.microsoft.com/office/word/2018/wordml/cex" xmlns:w16cid="http://schemas.microsoft.com/office/word/2016/wordml/cid" xmlns:w16="http://schemas.microsoft.com/office/word/2018/wordml" xmlns:w16du="http://schemas.microsoft.com/office/word/2023/wordml/word16du" xmlns:w16sdtdh="http://schemas.microsoft.com/office/word/2020/wordml/sdtdatahash" xmlns:w16sdtfl="http://schemas.microsoft.com/office/word/2024/wordml/sdtformatlock" xmlns:w16se="http://schemas.microsoft.com/office/word/2015/wordml/symex" xmlns:wpg="http://schemas.microsoft.com/office/word/2010/wordprocessingGroup" xmlns:wpi="http://schemas.microsoft.com/office/word/2010/wordprocessingInk" xmlns:wne="http://schemas.microsoft.com/office/word/2006/wordml" xmlns:wps="http://schemas.microsoft.com/office/word/2010/wordprocessingShape" mc:Ignorable="w14 w15 w16se w16cid w16 w16cex w16sdtdh w16sdtfl w16du wp14">
+  <w:abstractNum w:abstractNumId="0" w15:restartNumberingAfterBreak="0">
     <w:nsid w:val="170CD2DE"/>
     <w:multiLevelType w:val="multilevel"/>
     <w:tmpl w:val="C09E2436"/>
@@ -3115,9 +3115,9 @@
       <w:lvlJc w:val="left"/>
       <w:pPr>
         <w:tabs>
-          <w:tab w:pos="0" w:val="num"/>
+          <w:tab w:val="num" w:pos="0"/>
         </w:tabs>
-        <w:ind w:hanging="480" w:left="480"/>
+        <w:ind w:left="480" w:hanging="480"/>
       </w:pPr>
     </w:lvl>
     <w:lvl w:ilvl="1">
@@ -3126,9 +3126,9 @@
       <w:lvlJc w:val="left"/>
       <w:pPr>
         <w:tabs>
-          <w:tab w:pos="720" w:val="num"/>
+          <w:tab w:val="num" w:pos="720"/>
         </w:tabs>
-        <w:ind w:hanging="480" w:left="1200"/>
+        <w:ind w:left="1200" w:hanging="480"/>
       </w:pPr>
     </w:lvl>
     <w:lvl w:ilvl="2">
@@ -3137,9 +3137,9 @@
       <w:lvlJc w:val="left"/>
       <w:pPr>
         <w:tabs>
-          <w:tab w:pos="1440" w:val="num"/>
+          <w:tab w:val="num" w:pos="1440"/>
         </w:tabs>
-        <w:ind w:hanging="480" w:left="1920"/>
+        <w:ind w:left="1920" w:hanging="480"/>
       </w:pPr>
     </w:lvl>
     <w:lvl w:ilvl="3">
@@ -3148,9 +3148,9 @@
       <w:lvlJc w:val="left"/>
       <w:pPr>
         <w:tabs>
-          <w:tab w:pos="2160" w:val="num"/>
+          <w:tab w:val="num" w:pos="2160"/>
         </w:tabs>
-        <w:ind w:hanging="480" w:left="2640"/>
+        <w:ind w:left="2640" w:hanging="480"/>
       </w:pPr>
     </w:lvl>
     <w:lvl w:ilvl="4">
@@ -3159,9 +3159,9 @@
       <w:lvlJc w:val="left"/>
       <w:pPr>
         <w:tabs>
-          <w:tab w:pos="2880" w:val="num"/>
+          <w:tab w:val="num" w:pos="2880"/>
         </w:tabs>
-        <w:ind w:hanging="480" w:left="3360"/>
+        <w:ind w:left="3360" w:hanging="480"/>
       </w:pPr>
     </w:lvl>
     <w:lvl w:ilvl="5">
@@ -3170,9 +3170,9 @@
       <w:lvlJc w:val="left"/>
       <w:pPr>
         <w:tabs>
-          <w:tab w:pos="3600" w:val="num"/>
+          <w:tab w:val="num" w:pos="3600"/>
         </w:tabs>
-        <w:ind w:hanging="480" w:left="4080"/>
+        <w:ind w:left="4080" w:hanging="480"/>
       </w:pPr>
     </w:lvl>
     <w:lvl w:ilvl="6">
@@ -3181,9 +3181,9 @@
       <w:lvlJc w:val="left"/>
       <w:pPr>
         <w:tabs>
-          <w:tab w:pos="4320" w:val="num"/>
+          <w:tab w:val="num" w:pos="4320"/>
         </w:tabs>
-        <w:ind w:hanging="480" w:left="4800"/>
+        <w:ind w:left="4800" w:hanging="480"/>
       </w:pPr>
     </w:lvl>
     <w:lvl w:ilvl="7">
@@ -3192,9 +3192,9 @@
       <w:lvlJc w:val="left"/>
       <w:pPr>
         <w:tabs>
-          <w:tab w:pos="5040" w:val="num"/>
+          <w:tab w:val="num" w:pos="5040"/>
         </w:tabs>
-        <w:ind w:hanging="480" w:left="5520"/>
+        <w:ind w:left="5520" w:hanging="480"/>
       </w:pPr>
     </w:lvl>
     <w:lvl w:ilvl="8">
@@ -3203,9 +3203,9 @@
       <w:lvlJc w:val="left"/>
       <w:pPr>
         <w:tabs>
-          <w:tab w:pos="5760" w:val="num"/>
+          <w:tab w:val="num" w:pos="5760"/>
         </w:tabs>
-        <w:ind w:hanging="480" w:left="6240"/>
+        <w:ind w:left="6240" w:hanging="480"/>
       </w:pPr>
     </w:lvl>
   </w:abstractNum>
@@ -3285,7 +3285,7 @@
       </w:pPr>
     </w:lvl>
   </w:abstractNum>
-  <w:num w16cid:durableId="1217203207" w:numId="1">
+  <w:num w:numId="1" w16cid:durableId="1217203207">
     <w:abstractNumId w:val="0"/>
   </w:num>
   <w:num w:numId="1000">
@@ -3295,14 +3295,14 @@
 </file>
 
 <file path=word/styles.xml><?xml version="1.0" encoding="utf-8"?>
-<w:styles xmlns:mc="http://schemas.openxmlformats.org/markup-compatibility/2006" xmlns:r="http://schemas.openxmlformats.org/officeDocument/2006/relationships" xmlns:w="http://schemas.openxmlformats.org/wordprocessingml/2006/main" xmlns:w14="http://schemas.microsoft.com/office/word/2010/wordml" xmlns:w15="http://schemas.microsoft.com/office/word/2012/wordml" xmlns:w16="http://schemas.microsoft.com/office/word/2018/wordml" xmlns:w16cex="http://schemas.microsoft.com/office/word/2018/wordml/cex" xmlns:w16cid="http://schemas.microsoft.com/office/word/2016/wordml/cid" xmlns:w16du="http://schemas.microsoft.com/office/word/2023/wordml/word16du" xmlns:w16sdtdh="http://schemas.microsoft.com/office/word/2020/wordml/sdtdatahash" xmlns:w16sdtfl="http://schemas.microsoft.com/office/word/2024/wordml/sdtformatlock" xmlns:w16se="http://schemas.microsoft.com/office/word/2015/wordml/symex" mc:Ignorable="w14 w15 w16se w16cid w16 w16cex w16sdtdh w16sdtfl w16du">
+<w:styles xmlns:mc="http://schemas.openxmlformats.org/markup-compatibility/2006" xmlns:r="http://schemas.openxmlformats.org/officeDocument/2006/relationships" xmlns:w="http://schemas.openxmlformats.org/wordprocessingml/2006/main" xmlns:w14="http://schemas.microsoft.com/office/word/2010/wordml" xmlns:w15="http://schemas.microsoft.com/office/word/2012/wordml" xmlns:w16cex="http://schemas.microsoft.com/office/word/2018/wordml/cex" xmlns:w16cid="http://schemas.microsoft.com/office/word/2016/wordml/cid" xmlns:w16="http://schemas.microsoft.com/office/word/2018/wordml" xmlns:w16du="http://schemas.microsoft.com/office/word/2023/wordml/word16du" xmlns:w16sdtdh="http://schemas.microsoft.com/office/word/2020/wordml/sdtdatahash" xmlns:w16sdtfl="http://schemas.microsoft.com/office/word/2024/wordml/sdtformatlock" xmlns:w16se="http://schemas.microsoft.com/office/word/2015/wordml/symex" mc:Ignorable="w14 w15 w16se w16cid w16 w16cex w16sdtdh w16sdtfl w16du">
   <w:docDefaults>
     <w:rPrDefault>
       <w:rPr>
-        <w:rFonts w:asciiTheme="minorHAnsi" w:cstheme="minorBidi" w:eastAsiaTheme="minorEastAsia" w:hAnsiTheme="minorHAnsi"/>
+        <w:rFonts w:asciiTheme="minorHAnsi" w:eastAsiaTheme="minorEastAsia" w:hAnsiTheme="minorHAnsi" w:cstheme="minorBidi"/>
         <w:sz w:val="24"/>
         <w:szCs w:val="24"/>
-        <w:lang w:bidi="ar-SA" w:eastAsia="zh-CN" w:val="en-US"/>
+        <w:lang w:val="en-US" w:eastAsia="zh-CN" w:bidi="ar-SA"/>
       </w:rPr>
     </w:rPrDefault>
     <w:pPrDefault>
@@ -3311,7 +3311,7 @@
       </w:pPr>
     </w:pPrDefault>
   </w:docDefaults>
-  <w:latentStyles w:count="376" w:defLockedState="0" w:defQFormat="0" w:defSemiHidden="0" w:defUIPriority="0" w:defUnhideWhenUsed="0">
+  <w:latentStyles w:defLockedState="0" w:defUIPriority="0" w:defSemiHidden="0" w:defUnhideWhenUsed="0" w:defQFormat="0" w:count="376">
     <w:lsdException w:name="Normal Table" w:semiHidden="1" w:unhideWhenUsed="1"/>
     <w:lsdException w:name="Table Simple 1" w:semiHidden="1" w:unhideWhenUsed="1"/>
     <w:lsdException w:name="Table Simple 2" w:semiHidden="1" w:unhideWhenUsed="1"/>
@@ -3555,14 +3555,14 @@
     <w:lsdException w:name="Unresolved Mention" w:semiHidden="1" w:uiPriority="99" w:unhideWhenUsed="1"/>
     <w:lsdException w:name="Smart Link" w:semiHidden="1" w:uiPriority="99" w:unhideWhenUsed="1"/>
   </w:latentStyles>
-  <w:style w:default="1" w:styleId="Normal" w:type="paragraph">
+  <w:style w:type="paragraph" w:default="1" w:styleId="Normal">
     <w:name w:val="Normal"/>
     <w:qFormat/>
     <w:rPr>
       <w:lang w:val="pt-BR"/>
     </w:rPr>
   </w:style>
-  <w:style w:styleId="Ttulo1" w:type="paragraph">
+  <w:style w:type="paragraph" w:styleId="Ttulo1">
     <w:name w:val="heading 1"/>
     <w:basedOn w:val="Normal"/>
     <w:next w:val="Corpodetexto"/>
@@ -3573,17 +3573,17 @@
     <w:pPr>
       <w:keepNext/>
       <w:keepLines/>
-      <w:spacing w:after="80" w:before="360"/>
+      <w:spacing w:before="360" w:after="80"/>
       <w:outlineLvl w:val="0"/>
     </w:pPr>
     <w:rPr>
-      <w:rFonts w:asciiTheme="majorHAnsi" w:cstheme="majorBidi" w:eastAsiaTheme="majorEastAsia" w:hAnsiTheme="majorHAnsi"/>
-      <w:color w:themeColor="accent1" w:themeShade="BF" w:val="0F4761"/>
+      <w:rFonts w:asciiTheme="majorHAnsi" w:eastAsiaTheme="majorEastAsia" w:hAnsiTheme="majorHAnsi" w:cstheme="majorBidi"/>
+      <w:color w:val="0F4761" w:themeColor="accent1" w:themeShade="BF"/>
       <w:sz w:val="40"/>
       <w:szCs w:val="40"/>
     </w:rPr>
   </w:style>
-  <w:style w:styleId="Ttulo2" w:type="paragraph">
+  <w:style w:type="paragraph" w:styleId="Ttulo2">
     <w:name w:val="heading 2"/>
     <w:basedOn w:val="Normal"/>
     <w:next w:val="Corpodetexto"/>
@@ -3596,17 +3596,17 @@
     <w:pPr>
       <w:keepNext/>
       <w:keepLines/>
-      <w:spacing w:after="80" w:before="160"/>
+      <w:spacing w:before="160" w:after="80"/>
       <w:outlineLvl w:val="1"/>
     </w:pPr>
     <w:rPr>
-      <w:rFonts w:asciiTheme="majorHAnsi" w:cstheme="majorBidi" w:eastAsiaTheme="majorEastAsia" w:hAnsiTheme="majorHAnsi"/>
-      <w:color w:themeColor="accent1" w:themeShade="BF" w:val="0F4761"/>
+      <w:rFonts w:asciiTheme="majorHAnsi" w:eastAsiaTheme="majorEastAsia" w:hAnsiTheme="majorHAnsi" w:cstheme="majorBidi"/>
+      <w:color w:val="0F4761" w:themeColor="accent1" w:themeShade="BF"/>
       <w:sz w:val="32"/>
       <w:szCs w:val="32"/>
     </w:rPr>
   </w:style>
-  <w:style w:styleId="Ttulo3" w:type="paragraph">
+  <w:style w:type="paragraph" w:styleId="Ttulo3">
     <w:name w:val="heading 3"/>
     <w:basedOn w:val="Normal"/>
     <w:next w:val="Corpodetexto"/>
@@ -3619,17 +3619,17 @@
     <w:pPr>
       <w:keepNext/>
       <w:keepLines/>
-      <w:spacing w:after="80" w:before="160"/>
+      <w:spacing w:before="160" w:after="80"/>
       <w:outlineLvl w:val="2"/>
     </w:pPr>
     <w:rPr>
-      <w:rFonts w:cstheme="majorBidi" w:eastAsiaTheme="majorEastAsia"/>
-      <w:color w:themeColor="accent1" w:themeShade="BF" w:val="0F4761"/>
+      <w:rFonts w:eastAsiaTheme="majorEastAsia" w:cstheme="majorBidi"/>
+      <w:color w:val="0F4761" w:themeColor="accent1" w:themeShade="BF"/>
       <w:sz w:val="28"/>
       <w:szCs w:val="28"/>
     </w:rPr>
   </w:style>
-  <w:style w:styleId="Ttulo4" w:type="paragraph">
+  <w:style w:type="paragraph" w:styleId="Ttulo4">
     <w:name w:val="heading 4"/>
     <w:basedOn w:val="Normal"/>
     <w:next w:val="Corpodetexto"/>
@@ -3642,17 +3642,17 @@
     <w:pPr>
       <w:keepNext/>
       <w:keepLines/>
-      <w:spacing w:after="40" w:before="80"/>
+      <w:spacing w:before="80" w:after="40"/>
       <w:outlineLvl w:val="3"/>
     </w:pPr>
     <w:rPr>
-      <w:rFonts w:cstheme="majorBidi" w:eastAsiaTheme="majorEastAsia"/>
+      <w:rFonts w:eastAsiaTheme="majorEastAsia" w:cstheme="majorBidi"/>
       <w:i/>
       <w:iCs/>
-      <w:color w:themeColor="accent1" w:themeShade="BF" w:val="0F4761"/>
-    </w:rPr>
-  </w:style>
-  <w:style w:styleId="Ttulo5" w:type="paragraph">
+      <w:color w:val="0F4761" w:themeColor="accent1" w:themeShade="BF"/>
+    </w:rPr>
+  </w:style>
+  <w:style w:type="paragraph" w:styleId="Ttulo5">
     <w:name w:val="heading 5"/>
     <w:basedOn w:val="Normal"/>
     <w:next w:val="Corpodetexto"/>
@@ -3665,15 +3665,15 @@
     <w:pPr>
       <w:keepNext/>
       <w:keepLines/>
-      <w:spacing w:after="40" w:before="80"/>
+      <w:spacing w:before="80" w:after="40"/>
       <w:outlineLvl w:val="4"/>
     </w:pPr>
     <w:rPr>
-      <w:rFonts w:cstheme="majorBidi" w:eastAsiaTheme="majorEastAsia"/>
-      <w:color w:themeColor="accent1" w:themeShade="BF" w:val="0F4761"/>
-    </w:rPr>
-  </w:style>
-  <w:style w:styleId="Ttulo6" w:type="paragraph">
+      <w:rFonts w:eastAsiaTheme="majorEastAsia" w:cstheme="majorBidi"/>
+      <w:color w:val="0F4761" w:themeColor="accent1" w:themeShade="BF"/>
+    </w:rPr>
+  </w:style>
+  <w:style w:type="paragraph" w:styleId="Ttulo6">
     <w:name w:val="heading 6"/>
     <w:basedOn w:val="Normal"/>
     <w:next w:val="Corpodetexto"/>
@@ -3686,17 +3686,17 @@
     <w:pPr>
       <w:keepNext/>
       <w:keepLines/>
-      <w:spacing w:after="0" w:before="40"/>
+      <w:spacing w:before="40" w:after="0"/>
       <w:outlineLvl w:val="5"/>
     </w:pPr>
     <w:rPr>
-      <w:rFonts w:cstheme="majorBidi" w:eastAsiaTheme="majorEastAsia"/>
+      <w:rFonts w:eastAsiaTheme="majorEastAsia" w:cstheme="majorBidi"/>
       <w:i/>
       <w:iCs/>
-      <w:color w:themeColor="text1" w:themeTint="A6" w:val="595959"/>
-    </w:rPr>
-  </w:style>
-  <w:style w:styleId="Ttulo7" w:type="paragraph">
+      <w:color w:val="595959" w:themeColor="text1" w:themeTint="A6"/>
+    </w:rPr>
+  </w:style>
+  <w:style w:type="paragraph" w:styleId="Ttulo7">
     <w:name w:val="heading 7"/>
     <w:basedOn w:val="Normal"/>
     <w:next w:val="Corpodetexto"/>
@@ -3709,15 +3709,15 @@
     <w:pPr>
       <w:keepNext/>
       <w:keepLines/>
-      <w:spacing w:after="0" w:before="40"/>
+      <w:spacing w:before="40" w:after="0"/>
       <w:outlineLvl w:val="6"/>
     </w:pPr>
     <w:rPr>
-      <w:rFonts w:cstheme="majorBidi" w:eastAsiaTheme="majorEastAsia"/>
-      <w:color w:themeColor="text1" w:themeTint="A6" w:val="595959"/>
-    </w:rPr>
-  </w:style>
-  <w:style w:styleId="Ttulo8" w:type="paragraph">
+      <w:rFonts w:eastAsiaTheme="majorEastAsia" w:cstheme="majorBidi"/>
+      <w:color w:val="595959" w:themeColor="text1" w:themeTint="A6"/>
+    </w:rPr>
+  </w:style>
+  <w:style w:type="paragraph" w:styleId="Ttulo8">
     <w:name w:val="heading 8"/>
     <w:basedOn w:val="Normal"/>
     <w:next w:val="Corpodetexto"/>
@@ -3734,13 +3734,13 @@
       <w:outlineLvl w:val="7"/>
     </w:pPr>
     <w:rPr>
-      <w:rFonts w:cstheme="majorBidi" w:eastAsiaTheme="majorEastAsia"/>
+      <w:rFonts w:eastAsiaTheme="majorEastAsia" w:cstheme="majorBidi"/>
       <w:i/>
       <w:iCs/>
-      <w:color w:themeColor="text1" w:themeTint="D8" w:val="272727"/>
-    </w:rPr>
-  </w:style>
-  <w:style w:styleId="Ttulo9" w:type="paragraph">
+      <w:color w:val="272727" w:themeColor="text1" w:themeTint="D8"/>
+    </w:rPr>
+  </w:style>
+  <w:style w:type="paragraph" w:styleId="Ttulo9">
     <w:name w:val="heading 9"/>
     <w:basedOn w:val="Normal"/>
     <w:next w:val="Corpodetexto"/>
@@ -3757,60 +3757,60 @@
       <w:outlineLvl w:val="8"/>
     </w:pPr>
     <w:rPr>
-      <w:rFonts w:cstheme="majorBidi" w:eastAsiaTheme="majorEastAsia"/>
-      <w:color w:themeColor="text1" w:themeTint="D8" w:val="272727"/>
-    </w:rPr>
-  </w:style>
-  <w:style w:default="1" w:styleId="Fontepargpadro" w:type="character">
+      <w:rFonts w:eastAsiaTheme="majorEastAsia" w:cstheme="majorBidi"/>
+      <w:color w:val="272727" w:themeColor="text1" w:themeTint="D8"/>
+    </w:rPr>
+  </w:style>
+  <w:style w:type="character" w:default="1" w:styleId="Fontepargpadro">
     <w:name w:val="Default Paragraph Font"/>
     <w:uiPriority w:val="1"/>
     <w:semiHidden/>
     <w:unhideWhenUsed/>
   </w:style>
-  <w:style w:default="1" w:styleId="Tabelanormal" w:type="table">
+  <w:style w:type="table" w:default="1" w:styleId="Tabelanormal">
     <w:name w:val="Normal Table"/>
     <w:uiPriority w:val="99"/>
     <w:semiHidden/>
     <w:unhideWhenUsed/>
     <w:tblPr>
-      <w:tblInd w:type="dxa" w:w="0"/>
+      <w:tblInd w:w="0" w:type="dxa"/>
       <w:tblCellMar>
-        <w:top w:type="dxa" w:w="0"/>
-        <w:left w:type="dxa" w:w="108"/>
-        <w:bottom w:type="dxa" w:w="0"/>
-        <w:right w:type="dxa" w:w="108"/>
+        <w:top w:w="0" w:type="dxa"/>
+        <w:left w:w="108" w:type="dxa"/>
+        <w:bottom w:w="0" w:type="dxa"/>
+        <w:right w:w="108" w:type="dxa"/>
       </w:tblCellMar>
     </w:tblPr>
   </w:style>
-  <w:style w:default="1" w:styleId="Semlista" w:type="numbering">
+  <w:style w:type="numbering" w:default="1" w:styleId="Semlista">
     <w:name w:val="No List"/>
     <w:uiPriority w:val="99"/>
     <w:semiHidden/>
     <w:unhideWhenUsed/>
   </w:style>
-  <w:style w:styleId="Corpodetexto" w:type="paragraph">
+  <w:style w:type="paragraph" w:styleId="Corpodetexto">
     <w:name w:val="Body Text"/>
     <w:basedOn w:val="Normal"/>
     <w:qFormat/>
     <w:pPr>
-      <w:spacing w:after="180" w:before="180"/>
+      <w:spacing w:before="180" w:after="180"/>
     </w:pPr>
   </w:style>
-  <w:style w:customStyle="1" w:styleId="FirstParagraph" w:type="paragraph">
+  <w:style w:type="paragraph" w:customStyle="1" w:styleId="FirstParagraph">
     <w:name w:val="First Paragraph"/>
     <w:basedOn w:val="Corpodetexto"/>
     <w:next w:val="Corpodetexto"/>
     <w:qFormat/>
   </w:style>
-  <w:style w:customStyle="1" w:styleId="Compact" w:type="paragraph">
+  <w:style w:type="paragraph" w:customStyle="1" w:styleId="Compact">
     <w:name w:val="Compact"/>
     <w:basedOn w:val="Corpodetexto"/>
     <w:qFormat/>
     <w:pPr>
-      <w:spacing w:after="36" w:before="36"/>
+      <w:spacing w:before="36" w:after="36"/>
     </w:pPr>
   </w:style>
-  <w:style w:styleId="Ttulo" w:type="paragraph">
+  <w:style w:type="paragraph" w:styleId="Ttulo">
     <w:name w:val="Title"/>
     <w:basedOn w:val="Normal"/>
     <w:next w:val="Corpodetexto"/>
@@ -3824,24 +3824,24 @@
       <w:jc w:val="center"/>
     </w:pPr>
     <w:rPr>
-      <w:rFonts w:asciiTheme="majorHAnsi" w:cstheme="majorBidi" w:eastAsiaTheme="majorEastAsia" w:hAnsiTheme="majorHAnsi"/>
+      <w:rFonts w:asciiTheme="majorHAnsi" w:eastAsiaTheme="majorEastAsia" w:hAnsiTheme="majorHAnsi" w:cstheme="majorBidi"/>
       <w:sz w:val="56"/>
       <w:szCs w:val="56"/>
     </w:rPr>
   </w:style>
-  <w:style w:customStyle="1" w:styleId="TtuloChar" w:type="character">
+  <w:style w:type="character" w:customStyle="1" w:styleId="TtuloChar">
     <w:name w:val="Título Char"/>
     <w:basedOn w:val="Fontepargpadro"/>
     <w:link w:val="Ttulo"/>
     <w:uiPriority w:val="10"/>
     <w:rsid w:val="00A10FD9"/>
     <w:rPr>
-      <w:rFonts w:asciiTheme="majorHAnsi" w:cstheme="majorBidi" w:eastAsiaTheme="majorEastAsia" w:hAnsiTheme="majorHAnsi"/>
+      <w:rFonts w:asciiTheme="majorHAnsi" w:eastAsiaTheme="majorEastAsia" w:hAnsiTheme="majorHAnsi" w:cstheme="majorBidi"/>
       <w:sz w:val="56"/>
       <w:szCs w:val="56"/>
     </w:rPr>
   </w:style>
-  <w:style w:styleId="Subttulo" w:type="paragraph">
+  <w:style w:type="paragraph" w:styleId="Subttulo">
     <w:name w:val="Subtitle"/>
     <w:basedOn w:val="Ttulo"/>
     <w:next w:val="Corpodetexto"/>
@@ -3860,21 +3860,21 @@
       <w:szCs w:val="28"/>
     </w:rPr>
   </w:style>
-  <w:style w:customStyle="1" w:styleId="SubttuloChar" w:type="character">
+  <w:style w:type="character" w:customStyle="1" w:styleId="SubttuloChar">
     <w:name w:val="Subtítulo Char"/>
     <w:basedOn w:val="Fontepargpadro"/>
     <w:link w:val="Subttulo"/>
     <w:uiPriority w:val="11"/>
     <w:rsid w:val="00A10FD9"/>
     <w:rPr>
-      <w:rFonts w:cstheme="majorBidi" w:eastAsiaTheme="majorEastAsia"/>
-      <w:color w:themeColor="text1" w:themeTint="A6" w:val="595959"/>
+      <w:rFonts w:eastAsiaTheme="majorEastAsia" w:cstheme="majorBidi"/>
+      <w:color w:val="595959" w:themeColor="text1" w:themeTint="A6"/>
       <w:spacing w:val="15"/>
       <w:sz w:val="28"/>
       <w:szCs w:val="28"/>
     </w:rPr>
   </w:style>
-  <w:style w:customStyle="1" w:styleId="Author" w:type="paragraph">
+  <w:style w:type="paragraph" w:customStyle="1" w:styleId="Author">
     <w:name w:val="Author"/>
     <w:basedOn w:val="Ttulo"/>
     <w:next w:val="Corpodetexto"/>
@@ -3888,7 +3888,7 @@
       <w:szCs w:val="24"/>
     </w:rPr>
   </w:style>
-  <w:style w:styleId="Data" w:type="paragraph">
+  <w:style w:type="paragraph" w:styleId="Data">
     <w:name w:val="Date"/>
     <w:basedOn w:val="Ttulo"/>
     <w:next w:val="Corpodetexto"/>
@@ -3902,7 +3902,7 @@
       <w:szCs w:val="24"/>
     </w:rPr>
   </w:style>
-  <w:style w:customStyle="1" w:styleId="AbstractTitle" w:type="paragraph">
+  <w:style w:type="paragraph" w:customStyle="1" w:styleId="AbstractTitle">
     <w:name w:val="Abstract Title"/>
     <w:basedOn w:val="Normal"/>
     <w:next w:val="Abstract"/>
@@ -3910,7 +3910,7 @@
     <w:pPr>
       <w:keepNext/>
       <w:keepLines/>
-      <w:spacing w:after="0" w:before="300"/>
+      <w:spacing w:before="300" w:after="0"/>
       <w:jc w:val="center"/>
     </w:pPr>
     <w:rPr>
@@ -3919,7 +3919,7 @@
       <w:szCs w:val="20"/>
     </w:rPr>
   </w:style>
-  <w:style w:customStyle="1" w:styleId="Abstract" w:type="paragraph">
+  <w:style w:type="paragraph" w:customStyle="1" w:styleId="Abstract">
     <w:name w:val="Abstract"/>
     <w:basedOn w:val="Normal"/>
     <w:next w:val="Corpodetexto"/>
@@ -3927,32 +3927,32 @@
     <w:pPr>
       <w:keepNext/>
       <w:keepLines/>
-      <w:spacing w:after="300" w:before="100"/>
+      <w:spacing w:before="100" w:after="300"/>
     </w:pPr>
     <w:rPr>
       <w:sz w:val="20"/>
       <w:szCs w:val="20"/>
     </w:rPr>
   </w:style>
-  <w:style w:styleId="Bibliografia" w:type="paragraph">
+  <w:style w:type="paragraph" w:styleId="Bibliografia">
     <w:name w:val="Bibliography"/>
     <w:basedOn w:val="Normal"/>
     <w:qFormat/>
   </w:style>
-  <w:style w:customStyle="1" w:styleId="Ttulo1Char" w:type="character">
+  <w:style w:type="character" w:customStyle="1" w:styleId="Ttulo1Char">
     <w:name w:val="Título 1 Char"/>
     <w:basedOn w:val="Fontepargpadro"/>
     <w:link w:val="Ttulo1"/>
     <w:uiPriority w:val="9"/>
     <w:rsid w:val="00A10FD9"/>
     <w:rPr>
-      <w:rFonts w:asciiTheme="majorHAnsi" w:cstheme="majorBidi" w:eastAsiaTheme="majorEastAsia" w:hAnsiTheme="majorHAnsi"/>
-      <w:color w:themeColor="accent1" w:themeShade="BF" w:val="0F4761"/>
+      <w:rFonts w:asciiTheme="majorHAnsi" w:eastAsiaTheme="majorEastAsia" w:hAnsiTheme="majorHAnsi" w:cstheme="majorBidi"/>
+      <w:color w:val="0F4761" w:themeColor="accent1" w:themeShade="BF"/>
       <w:sz w:val="40"/>
       <w:szCs w:val="40"/>
     </w:rPr>
   </w:style>
-  <w:style w:customStyle="1" w:styleId="Ttulo2Char" w:type="character">
+  <w:style w:type="character" w:customStyle="1" w:styleId="Ttulo2Char">
     <w:name w:val="Título 2 Char"/>
     <w:basedOn w:val="Fontepargpadro"/>
     <w:link w:val="Ttulo2"/>
@@ -3960,13 +3960,13 @@
     <w:semiHidden/>
     <w:rsid w:val="00A10FD9"/>
     <w:rPr>
-      <w:rFonts w:asciiTheme="majorHAnsi" w:cstheme="majorBidi" w:eastAsiaTheme="majorEastAsia" w:hAnsiTheme="majorHAnsi"/>
-      <w:color w:themeColor="accent1" w:themeShade="BF" w:val="0F4761"/>
+      <w:rFonts w:asciiTheme="majorHAnsi" w:eastAsiaTheme="majorEastAsia" w:hAnsiTheme="majorHAnsi" w:cstheme="majorBidi"/>
+      <w:color w:val="0F4761" w:themeColor="accent1" w:themeShade="BF"/>
       <w:sz w:val="32"/>
       <w:szCs w:val="32"/>
     </w:rPr>
   </w:style>
-  <w:style w:customStyle="1" w:styleId="Ttulo3Char" w:type="character">
+  <w:style w:type="character" w:customStyle="1" w:styleId="Ttulo3Char">
     <w:name w:val="Título 3 Char"/>
     <w:basedOn w:val="Fontepargpadro"/>
     <w:link w:val="Ttulo3"/>
@@ -3974,13 +3974,13 @@
     <w:semiHidden/>
     <w:rsid w:val="00A10FD9"/>
     <w:rPr>
-      <w:rFonts w:cstheme="majorBidi" w:eastAsiaTheme="majorEastAsia"/>
-      <w:color w:themeColor="accent1" w:themeShade="BF" w:val="0F4761"/>
+      <w:rFonts w:eastAsiaTheme="majorEastAsia" w:cstheme="majorBidi"/>
+      <w:color w:val="0F4761" w:themeColor="accent1" w:themeShade="BF"/>
       <w:sz w:val="28"/>
       <w:szCs w:val="28"/>
     </w:rPr>
   </w:style>
-  <w:style w:customStyle="1" w:styleId="Ttulo4Char" w:type="character">
+  <w:style w:type="character" w:customStyle="1" w:styleId="Ttulo4Char">
     <w:name w:val="Título 4 Char"/>
     <w:basedOn w:val="Fontepargpadro"/>
     <w:link w:val="Ttulo4"/>
@@ -3988,13 +3988,13 @@
     <w:semiHidden/>
     <w:rsid w:val="00A10FD9"/>
     <w:rPr>
-      <w:rFonts w:cstheme="majorBidi" w:eastAsiaTheme="majorEastAsia"/>
+      <w:rFonts w:eastAsiaTheme="majorEastAsia" w:cstheme="majorBidi"/>
       <w:i/>
       <w:iCs/>
-      <w:color w:themeColor="accent1" w:themeShade="BF" w:val="0F4761"/>
-    </w:rPr>
-  </w:style>
-  <w:style w:customStyle="1" w:styleId="Ttulo5Char" w:type="character">
+      <w:color w:val="0F4761" w:themeColor="accent1" w:themeShade="BF"/>
+    </w:rPr>
+  </w:style>
+  <w:style w:type="character" w:customStyle="1" w:styleId="Ttulo5Char">
     <w:name w:val="Título 5 Char"/>
     <w:basedOn w:val="Fontepargpadro"/>
     <w:link w:val="Ttulo5"/>
@@ -4002,11 +4002,11 @@
     <w:semiHidden/>
     <w:rsid w:val="00A10FD9"/>
     <w:rPr>
-      <w:rFonts w:cstheme="majorBidi" w:eastAsiaTheme="majorEastAsia"/>
-      <w:color w:themeColor="accent1" w:themeShade="BF" w:val="0F4761"/>
-    </w:rPr>
-  </w:style>
-  <w:style w:customStyle="1" w:styleId="Ttulo6Char" w:type="character">
+      <w:rFonts w:eastAsiaTheme="majorEastAsia" w:cstheme="majorBidi"/>
+      <w:color w:val="0F4761" w:themeColor="accent1" w:themeShade="BF"/>
+    </w:rPr>
+  </w:style>
+  <w:style w:type="character" w:customStyle="1" w:styleId="Ttulo6Char">
     <w:name w:val="Título 6 Char"/>
     <w:basedOn w:val="Fontepargpadro"/>
     <w:link w:val="Ttulo6"/>
@@ -4014,13 +4014,13 @@
     <w:semiHidden/>
     <w:rsid w:val="00A10FD9"/>
     <w:rPr>
-      <w:rFonts w:cstheme="majorBidi" w:eastAsiaTheme="majorEastAsia"/>
+      <w:rFonts w:eastAsiaTheme="majorEastAsia" w:cstheme="majorBidi"/>
       <w:i/>
       <w:iCs/>
-      <w:color w:themeColor="text1" w:themeTint="A6" w:val="595959"/>
-    </w:rPr>
-  </w:style>
-  <w:style w:customStyle="1" w:styleId="Ttulo7Char" w:type="character">
+      <w:color w:val="595959" w:themeColor="text1" w:themeTint="A6"/>
+    </w:rPr>
+  </w:style>
+  <w:style w:type="character" w:customStyle="1" w:styleId="Ttulo7Char">
     <w:name w:val="Título 7 Char"/>
     <w:basedOn w:val="Fontepargpadro"/>
     <w:link w:val="Ttulo7"/>
@@ -4028,11 +4028,11 @@
     <w:semiHidden/>
     <w:rsid w:val="00A10FD9"/>
     <w:rPr>
-      <w:rFonts w:cstheme="majorBidi" w:eastAsiaTheme="majorEastAsia"/>
-      <w:color w:themeColor="text1" w:themeTint="A6" w:val="595959"/>
-    </w:rPr>
-  </w:style>
-  <w:style w:customStyle="1" w:styleId="Ttulo8Char" w:type="character">
+      <w:rFonts w:eastAsiaTheme="majorEastAsia" w:cstheme="majorBidi"/>
+      <w:color w:val="595959" w:themeColor="text1" w:themeTint="A6"/>
+    </w:rPr>
+  </w:style>
+  <w:style w:type="character" w:customStyle="1" w:styleId="Ttulo8Char">
     <w:name w:val="Título 8 Char"/>
     <w:basedOn w:val="Fontepargpadro"/>
     <w:link w:val="Ttulo8"/>
@@ -4040,13 +4040,13 @@
     <w:semiHidden/>
     <w:rsid w:val="00A10FD9"/>
     <w:rPr>
-      <w:rFonts w:cstheme="majorBidi" w:eastAsiaTheme="majorEastAsia"/>
+      <w:rFonts w:eastAsiaTheme="majorEastAsia" w:cstheme="majorBidi"/>
       <w:i/>
       <w:iCs/>
-      <w:color w:themeColor="text1" w:themeTint="D8" w:val="272727"/>
-    </w:rPr>
-  </w:style>
-  <w:style w:customStyle="1" w:styleId="Ttulo9Char" w:type="character">
+      <w:color w:val="272727" w:themeColor="text1" w:themeTint="D8"/>
+    </w:rPr>
+  </w:style>
+  <w:style w:type="character" w:customStyle="1" w:styleId="Ttulo9Char">
     <w:name w:val="Título 9 Char"/>
     <w:basedOn w:val="Fontepargpadro"/>
     <w:link w:val="Ttulo9"/>
@@ -4054,11 +4054,11 @@
     <w:semiHidden/>
     <w:rsid w:val="00A10FD9"/>
     <w:rPr>
-      <w:rFonts w:cstheme="majorBidi" w:eastAsiaTheme="majorEastAsia"/>
-      <w:color w:themeColor="text1" w:themeTint="D8" w:val="272727"/>
-    </w:rPr>
-  </w:style>
-  <w:style w:styleId="Textoembloco" w:type="paragraph">
+      <w:rFonts w:eastAsiaTheme="majorEastAsia" w:cstheme="majorBidi"/>
+      <w:color w:val="272727" w:themeColor="text1" w:themeTint="D8"/>
+    </w:rPr>
+  </w:style>
+  <w:style w:type="paragraph" w:styleId="Textoembloco">
     <w:name w:val="Block Text"/>
     <w:basedOn w:val="Corpodetexto"/>
     <w:next w:val="Corpodetexto"/>
@@ -4066,18 +4066,18 @@
     <w:unhideWhenUsed/>
     <w:qFormat/>
     <w:pPr>
-      <w:spacing w:after="100" w:before="100"/>
+      <w:spacing w:before="100" w:after="100"/>
       <w:ind w:left="480" w:right="480"/>
     </w:pPr>
   </w:style>
-  <w:style w:styleId="Textodenotaderodap" w:type="paragraph">
+  <w:style w:type="paragraph" w:styleId="Textodenotaderodap">
     <w:name w:val="footnote text"/>
     <w:basedOn w:val="Normal"/>
     <w:uiPriority w:val="9"/>
     <w:unhideWhenUsed/>
     <w:qFormat/>
   </w:style>
-  <w:style w:customStyle="1" w:styleId="FootnoteBlockText" w:type="paragraph">
+  <w:style w:type="paragraph" w:customStyle="1" w:styleId="FootnoteBlockText">
     <w:name w:val="Footnote Block Text"/>
     <w:basedOn w:val="Textodenotaderodap"/>
     <w:next w:val="Textodenotaderodap"/>
@@ -4085,35 +4085,35 @@
     <w:unhideWhenUsed/>
     <w:qFormat/>
     <w:pPr>
-      <w:spacing w:after="100" w:before="100"/>
+      <w:spacing w:before="100" w:after="100"/>
       <w:ind w:left="480" w:right="480"/>
     </w:pPr>
   </w:style>
-  <w:style w:customStyle="1" w:styleId="Table" w:type="table">
+  <w:style w:type="table" w:customStyle="1" w:styleId="Table">
     <w:name w:val="Table"/>
     <w:semiHidden/>
     <w:unhideWhenUsed/>
     <w:qFormat/>
     <w:tblPr>
-      <w:tblInd w:type="dxa" w:w="0"/>
+      <w:tblInd w:w="0" w:type="dxa"/>
       <w:tblCellMar>
-        <w:top w:type="dxa" w:w="0"/>
-        <w:left w:type="dxa" w:w="108"/>
-        <w:bottom w:type="dxa" w:w="0"/>
-        <w:right w:type="dxa" w:w="108"/>
+        <w:top w:w="0" w:type="dxa"/>
+        <w:left w:w="108" w:type="dxa"/>
+        <w:bottom w:w="0" w:type="dxa"/>
+        <w:right w:w="108" w:type="dxa"/>
       </w:tblCellMar>
     </w:tblPr>
     <w:tblStylePr w:type="firstRow">
       <w:tblPr/>
       <w:tcPr>
         <w:tcBorders>
-          <w:bottom w:color="auto" w:space="0" w:sz="0" w:val="single"/>
+          <w:bottom w:val="single" w:sz="0" w:space="0" w:color="auto"/>
         </w:tcBorders>
         <w:vAlign w:val="bottom"/>
       </w:tcPr>
     </w:tblStylePr>
   </w:style>
-  <w:style w:customStyle="1" w:styleId="DefinitionTerm" w:type="paragraph">
+  <w:style w:type="paragraph" w:customStyle="1" w:styleId="DefinitionTerm">
     <w:name w:val="Definition Term"/>
     <w:basedOn w:val="Normal"/>
     <w:next w:val="Definition"/>
@@ -4126,11 +4126,11 @@
       <w:b/>
     </w:rPr>
   </w:style>
-  <w:style w:customStyle="1" w:styleId="Definition" w:type="paragraph">
+  <w:style w:type="paragraph" w:customStyle="1" w:styleId="Definition">
     <w:name w:val="Definition"/>
     <w:basedOn w:val="Normal"/>
   </w:style>
-  <w:style w:styleId="Legenda" w:type="paragraph">
+  <w:style w:type="paragraph" w:styleId="Legenda">
     <w:name w:val="caption"/>
     <w:basedOn w:val="Normal"/>
     <w:link w:val="LegendaChar"/>
@@ -4141,34 +4141,34 @@
       <w:i/>
     </w:rPr>
   </w:style>
-  <w:style w:customStyle="1" w:styleId="TableCaption" w:type="paragraph">
+  <w:style w:type="paragraph" w:customStyle="1" w:styleId="TableCaption">
     <w:name w:val="Table Caption"/>
     <w:basedOn w:val="Legenda"/>
     <w:pPr>
       <w:keepNext/>
     </w:pPr>
   </w:style>
-  <w:style w:customStyle="1" w:styleId="ImageCaption" w:type="paragraph">
+  <w:style w:type="paragraph" w:customStyle="1" w:styleId="ImageCaption">
     <w:name w:val="Image Caption"/>
     <w:basedOn w:val="Legenda"/>
   </w:style>
-  <w:style w:customStyle="1" w:styleId="Figure" w:type="paragraph">
+  <w:style w:type="paragraph" w:customStyle="1" w:styleId="Figure">
     <w:name w:val="Figure"/>
     <w:basedOn w:val="Normal"/>
   </w:style>
-  <w:style w:customStyle="1" w:styleId="CaptionedFigure" w:type="paragraph">
+  <w:style w:type="paragraph" w:customStyle="1" w:styleId="CaptionedFigure">
     <w:name w:val="Captioned Figure"/>
     <w:basedOn w:val="Figure"/>
     <w:pPr>
       <w:keepNext/>
     </w:pPr>
   </w:style>
-  <w:style w:customStyle="1" w:styleId="LegendaChar" w:type="character">
+  <w:style w:type="character" w:customStyle="1" w:styleId="LegendaChar">
     <w:name w:val="Legenda Char"/>
     <w:basedOn w:val="Fontepargpadro"/>
     <w:link w:val="Legenda"/>
   </w:style>
-  <w:style w:customStyle="1" w:styleId="VerbatimChar" w:type="character">
+  <w:style w:type="character" w:customStyle="1" w:styleId="VerbatimChar">
     <w:name w:val="Verbatim Char"/>
     <w:basedOn w:val="LegendaChar"/>
     <w:rPr>
@@ -4176,25 +4176,25 @@
       <w:sz w:val="22"/>
     </w:rPr>
   </w:style>
-  <w:style w:customStyle="1" w:styleId="SectionNumber" w:type="character">
+  <w:style w:type="character" w:customStyle="1" w:styleId="SectionNumber">
     <w:name w:val="Section Number"/>
     <w:basedOn w:val="LegendaChar"/>
   </w:style>
-  <w:style w:styleId="Refdenotaderodap" w:type="character">
+  <w:style w:type="character" w:styleId="Refdenotaderodap">
     <w:name w:val="footnote reference"/>
     <w:basedOn w:val="LegendaChar"/>
     <w:rPr>
       <w:vertAlign w:val="superscript"/>
     </w:rPr>
   </w:style>
-  <w:style w:styleId="Hyperlink" w:type="character">
+  <w:style w:type="character" w:styleId="Hyperlink">
     <w:name w:val="Hyperlink"/>
     <w:basedOn w:val="LegendaChar"/>
     <w:rPr>
-      <w:color w:themeColor="accent1" w:val="156082"/>
-    </w:rPr>
-  </w:style>
-  <w:style w:styleId="CabealhodoSumrio" w:type="paragraph">
+      <w:color w:val="156082" w:themeColor="accent1"/>
+    </w:rPr>
+  </w:style>
+  <w:style w:type="paragraph" w:styleId="CabealhodoSumrio">
     <w:name w:val="TOC Heading"/>
     <w:basedOn w:val="Ttulo1"/>
     <w:next w:val="Corpodetexto"/>
@@ -4206,7 +4206,7 @@
       <w:outlineLvl w:val="9"/>
     </w:pPr>
   </w:style>
-  <w:style w:styleId="TabeladeGrade5Escura-nfase1" w:type="table">
+  <w:style w:type="table" w:styleId="TabeladeGrade5Escura-nfase1">
     <w:name w:val="Grid Table 5 Dark Accent 1"/>
     <w:basedOn w:val="Tabelanormal"/>
     <w:uiPriority w:val="50"/>
@@ -4218,139 +4218,139 @@
       <w:tblStyleRowBandSize w:val="1"/>
       <w:tblStyleColBandSize w:val="1"/>
       <w:tblBorders>
-        <w:top w:color="FFFFFF" w:space="0" w:sz="4" w:themeColor="background1" w:val="single"/>
-        <w:left w:color="FFFFFF" w:space="0" w:sz="4" w:themeColor="background1" w:val="single"/>
-        <w:bottom w:color="FFFFFF" w:space="0" w:sz="4" w:themeColor="background1" w:val="single"/>
-        <w:right w:color="FFFFFF" w:space="0" w:sz="4" w:themeColor="background1" w:val="single"/>
-        <w:insideH w:color="FFFFFF" w:space="0" w:sz="4" w:themeColor="background1" w:val="single"/>
-        <w:insideV w:color="FFFFFF" w:space="0" w:sz="4" w:themeColor="background1" w:val="single"/>
+        <w:top w:val="single" w:sz="4" w:space="0" w:color="FFFFFF" w:themeColor="background1"/>
+        <w:left w:val="single" w:sz="4" w:space="0" w:color="FFFFFF" w:themeColor="background1"/>
+        <w:bottom w:val="single" w:sz="4" w:space="0" w:color="FFFFFF" w:themeColor="background1"/>
+        <w:right w:val="single" w:sz="4" w:space="0" w:color="FFFFFF" w:themeColor="background1"/>
+        <w:insideH w:val="single" w:sz="4" w:space="0" w:color="FFFFFF" w:themeColor="background1"/>
+        <w:insideV w:val="single" w:sz="4" w:space="0" w:color="FFFFFF" w:themeColor="background1"/>
       </w:tblBorders>
     </w:tblPr>
     <w:tcPr>
-      <w:shd w:color="auto" w:fill="C1E4F5" w:themeFill="accent1" w:themeFillTint="33" w:val="clear"/>
+      <w:shd w:val="clear" w:color="auto" w:fill="C1E4F5" w:themeFill="accent1" w:themeFillTint="33"/>
     </w:tcPr>
     <w:tblStylePr w:type="firstRow">
       <w:rPr>
         <w:b/>
         <w:bCs/>
-        <w:color w:themeColor="background1" w:val="FFFFFF"/>
+        <w:color w:val="FFFFFF" w:themeColor="background1"/>
       </w:rPr>
       <w:tblPr/>
       <w:tcPr>
         <w:tcBorders>
-          <w:top w:color="FFFFFF" w:space="0" w:sz="4" w:themeColor="background1" w:val="single"/>
-          <w:left w:color="FFFFFF" w:space="0" w:sz="4" w:themeColor="background1" w:val="single"/>
-          <w:right w:color="FFFFFF" w:space="0" w:sz="4" w:themeColor="background1" w:val="single"/>
+          <w:top w:val="single" w:sz="4" w:space="0" w:color="FFFFFF" w:themeColor="background1"/>
+          <w:left w:val="single" w:sz="4" w:space="0" w:color="FFFFFF" w:themeColor="background1"/>
+          <w:right w:val="single" w:sz="4" w:space="0" w:color="FFFFFF" w:themeColor="background1"/>
           <w:insideH w:val="nil"/>
           <w:insideV w:val="nil"/>
         </w:tcBorders>
-        <w:shd w:color="auto" w:fill="156082" w:themeFill="accent1" w:val="clear"/>
+        <w:shd w:val="clear" w:color="auto" w:fill="156082" w:themeFill="accent1"/>
       </w:tcPr>
     </w:tblStylePr>
     <w:tblStylePr w:type="lastRow">
       <w:rPr>
         <w:b/>
         <w:bCs/>
-        <w:color w:themeColor="background1" w:val="FFFFFF"/>
+        <w:color w:val="FFFFFF" w:themeColor="background1"/>
       </w:rPr>
       <w:tblPr/>
       <w:tcPr>
         <w:tcBorders>
-          <w:left w:color="FFFFFF" w:space="0" w:sz="4" w:themeColor="background1" w:val="single"/>
-          <w:bottom w:color="FFFFFF" w:space="0" w:sz="4" w:themeColor="background1" w:val="single"/>
-          <w:right w:color="FFFFFF" w:space="0" w:sz="4" w:themeColor="background1" w:val="single"/>
+          <w:left w:val="single" w:sz="4" w:space="0" w:color="FFFFFF" w:themeColor="background1"/>
+          <w:bottom w:val="single" w:sz="4" w:space="0" w:color="FFFFFF" w:themeColor="background1"/>
+          <w:right w:val="single" w:sz="4" w:space="0" w:color="FFFFFF" w:themeColor="background1"/>
           <w:insideH w:val="nil"/>
           <w:insideV w:val="nil"/>
         </w:tcBorders>
-        <w:shd w:color="auto" w:fill="156082" w:themeFill="accent1" w:val="clear"/>
+        <w:shd w:val="clear" w:color="auto" w:fill="156082" w:themeFill="accent1"/>
       </w:tcPr>
     </w:tblStylePr>
     <w:tblStylePr w:type="firstCol">
       <w:rPr>
         <w:b/>
         <w:bCs/>
-        <w:color w:themeColor="background1" w:val="FFFFFF"/>
+        <w:color w:val="FFFFFF" w:themeColor="background1"/>
       </w:rPr>
       <w:tblPr/>
       <w:tcPr>
         <w:tcBorders>
-          <w:top w:color="FFFFFF" w:space="0" w:sz="4" w:themeColor="background1" w:val="single"/>
-          <w:left w:color="FFFFFF" w:space="0" w:sz="4" w:themeColor="background1" w:val="single"/>
-          <w:bottom w:color="FFFFFF" w:space="0" w:sz="4" w:themeColor="background1" w:val="single"/>
+          <w:top w:val="single" w:sz="4" w:space="0" w:color="FFFFFF" w:themeColor="background1"/>
+          <w:left w:val="single" w:sz="4" w:space="0" w:color="FFFFFF" w:themeColor="background1"/>
+          <w:bottom w:val="single" w:sz="4" w:space="0" w:color="FFFFFF" w:themeColor="background1"/>
           <w:insideV w:val="nil"/>
         </w:tcBorders>
-        <w:shd w:color="auto" w:fill="156082" w:themeFill="accent1" w:val="clear"/>
+        <w:shd w:val="clear" w:color="auto" w:fill="156082" w:themeFill="accent1"/>
       </w:tcPr>
     </w:tblStylePr>
     <w:tblStylePr w:type="lastCol">
       <w:rPr>
         <w:b/>
         <w:bCs/>
-        <w:color w:themeColor="background1" w:val="FFFFFF"/>
+        <w:color w:val="FFFFFF" w:themeColor="background1"/>
       </w:rPr>
       <w:tblPr/>
       <w:tcPr>
         <w:tcBorders>
-          <w:top w:color="FFFFFF" w:space="0" w:sz="4" w:themeColor="background1" w:val="single"/>
-          <w:bottom w:color="FFFFFF" w:space="0" w:sz="4" w:themeColor="background1" w:val="single"/>
-          <w:right w:color="FFFFFF" w:space="0" w:sz="4" w:themeColor="background1" w:val="single"/>
+          <w:top w:val="single" w:sz="4" w:space="0" w:color="FFFFFF" w:themeColor="background1"/>
+          <w:bottom w:val="single" w:sz="4" w:space="0" w:color="FFFFFF" w:themeColor="background1"/>
+          <w:right w:val="single" w:sz="4" w:space="0" w:color="FFFFFF" w:themeColor="background1"/>
           <w:insideV w:val="nil"/>
         </w:tcBorders>
-        <w:shd w:color="auto" w:fill="156082" w:themeFill="accent1" w:val="clear"/>
+        <w:shd w:val="clear" w:color="auto" w:fill="156082" w:themeFill="accent1"/>
       </w:tcPr>
     </w:tblStylePr>
     <w:tblStylePr w:type="band1Vert">
       <w:tblPr/>
       <w:tcPr>
-        <w:shd w:color="auto" w:fill="83CAEB" w:themeFill="accent1" w:themeFillTint="66" w:val="clear"/>
+        <w:shd w:val="clear" w:color="auto" w:fill="83CAEB" w:themeFill="accent1" w:themeFillTint="66"/>
       </w:tcPr>
     </w:tblStylePr>
     <w:tblStylePr w:type="band1Horz">
       <w:tblPr/>
       <w:tcPr>
-        <w:shd w:color="auto" w:fill="83CAEB" w:themeFill="accent1" w:themeFillTint="66" w:val="clear"/>
+        <w:shd w:val="clear" w:color="auto" w:fill="83CAEB" w:themeFill="accent1" w:themeFillTint="66"/>
       </w:tcPr>
     </w:tblStylePr>
   </w:style>
-  <w:style w:styleId="Cabealho" w:type="paragraph">
+  <w:style w:type="paragraph" w:styleId="Cabealho">
     <w:name w:val="header"/>
     <w:basedOn w:val="Normal"/>
     <w:link w:val="CabealhoChar"/>
     <w:rsid w:val="00102FF8"/>
     <w:pPr>
       <w:tabs>
-        <w:tab w:pos="4252" w:val="center"/>
-        <w:tab w:pos="8504" w:val="right"/>
+        <w:tab w:val="center" w:pos="4252"/>
+        <w:tab w:val="right" w:pos="8504"/>
       </w:tabs>
       <w:spacing w:after="0"/>
     </w:pPr>
   </w:style>
-  <w:style w:customStyle="1" w:styleId="CabealhoChar" w:type="character">
+  <w:style w:type="character" w:customStyle="1" w:styleId="CabealhoChar">
     <w:name w:val="Cabeçalho Char"/>
     <w:basedOn w:val="Fontepargpadro"/>
     <w:link w:val="Cabealho"/>
     <w:rsid w:val="00102FF8"/>
   </w:style>
-  <w:style w:styleId="Rodap" w:type="paragraph">
+  <w:style w:type="paragraph" w:styleId="Rodap">
     <w:name w:val="footer"/>
     <w:basedOn w:val="Normal"/>
     <w:link w:val="RodapChar"/>
     <w:rsid w:val="00102FF8"/>
     <w:pPr>
       <w:tabs>
-        <w:tab w:pos="4252" w:val="center"/>
-        <w:tab w:pos="8504" w:val="right"/>
+        <w:tab w:val="center" w:pos="4252"/>
+        <w:tab w:val="right" w:pos="8504"/>
       </w:tabs>
       <w:spacing w:after="0"/>
     </w:pPr>
   </w:style>
-  <w:style w:customStyle="1" w:styleId="RodapChar" w:type="character">
+  <w:style w:type="character" w:customStyle="1" w:styleId="RodapChar">
     <w:name w:val="Rodapé Char"/>
     <w:basedOn w:val="Fontepargpadro"/>
     <w:link w:val="Rodap"/>
     <w:rsid w:val="00102FF8"/>
   </w:style>
-  <w:style w:styleId="MenoPendente" w:type="character">
+  <w:style w:type="character" w:styleId="MenoPendente">
     <w:name w:val="Unresolved Mention"/>
     <w:basedOn w:val="Fontepargpadro"/>
     <w:uiPriority w:val="99"/>
@@ -4359,7 +4359,7 @@
     <w:rsid w:val="00892829"/>
     <w:rPr>
       <w:color w:val="605E5C"/>
-      <w:shd w:color="auto" w:fill="E1DFDD" w:val="clear"/>
+      <w:shd w:val="clear" w:color="auto" w:fill="E1DFDD"/>
     </w:rPr>
   </w:style>
   <w:style w:type="paragraph" w:customStyle="1" w:styleId="SourceCode">

</xml_diff>